<commit_message>
Genericise to Contoso Group + add 27 downloadable sample files for runbook + demo
- Rebrand industry-specific terms to generic conglomerate (Industrial Operations / Manufacturing / Property / Group Functions)
- Switch to USD, NYSE listing
- Generate 27 sample files (2 demo + 25 runbook) with realistic raw data:
  * Site daily production logs (with planted outage outlier on Site Beta Mar 11)
  * Capex model with NPV/IRR formulas, FX sensitivity
  * Investment Memorandum + Tech DD + Site Plan PDFs
  * Bank statements (PDF + PNG-scan)
  * Vendor onboarding form with UBO chain
  * Counterparty audited FS (3 years)
  * Talent profiles + 2-yr performance + engagement survey
  * Quarterly TB, Segment Reporting, Filing Template
  * Fuel logs, diesel receipts, meter-read scans, GHG tracker
  * Group FY27 Plan Model with 4 tabs
- Wire all 26 file chips as <a download> links + add hover state

Co-authored-by: Copilot <223556219+Copilot@users.noreply.github.com>
</commit_message>
<xml_diff>
--- a/files/02_Contoso_OpsReport.docx
+++ b/files/02_Contoso_OpsReport.docx
@@ -4,52 +4,34 @@
   <w:body>
     <w:p>
       <w:pPr>
-        <w:pStyle w:val="Heading1"/>
+        <w:jc w:val="left"/>
       </w:pPr>
       <w:r>
         <w:rPr>
-          <w:color w:val="1F5C2E"/>
+          <w:b/>
+          <w:color w:val="1F4E79"/>
+          <w:sz w:val="40"/>
         </w:rPr>
-        <w:t>Contoso Plantation Berhad</w:t>
-      </w:r>
-    </w:p>
-    <w:p>
-      <w:pPr>
-        <w:pStyle w:val="Heading2"/>
-      </w:pPr>
-      <w:r>
-        <w:rPr>
-          <w:color w:val="1F5C2E"/>
-        </w:rPr>
-        <w:t>Q1 2025 Group Operations Report</w:t>
+        <w:t>Contoso Group</w:t>
       </w:r>
     </w:p>
     <w:p>
       <w:r>
         <w:rPr>
-          <w:b w:val="0"/>
+          <w:color w:val="404040"/>
+          <w:sz w:val="28"/>
         </w:rPr>
-        <w:t>Confidential | For Internal Use &amp; Board Review Only | April 2025</w:t>
-      </w:r>
-    </w:p>
-    <w:p/>
-    <w:p>
-      <w:pPr>
-        <w:pStyle w:val="Heading1"/>
-      </w:pPr>
-      <w:r>
-        <w:rPr>
-          <w:color w:val="1F5C2E"/>
-        </w:rPr>
-        <w:t>1. Executive Summary</w:t>
+        <w:t>Q1 FY26 — Group Operations Report</w:t>
       </w:r>
     </w:p>
     <w:p>
       <w:r>
         <w:rPr>
-          <w:b w:val="0"/>
+          <w:i/>
+          <w:color w:val="808080"/>
+          <w:sz w:val="18"/>
         </w:rPr>
-        <w:t>Contoso Plantation Berhad delivered a mixed performance in Q1 2025. Group revenue reached MYR 2.1 billion, up 4.2% year-on-year, driven by strong CPO prices averaging MYR 4,250 per tonne. However, yield performance varied significantly across divisions, with Sumatra estates underperforming against OER targets.</w:t>
+        <w:t>Prepared by: Group Operations Office  |  Confidential — Internal Use Only  |  Reporting period: 1 January – 31 March 2026</w:t>
       </w:r>
     </w:p>
     <w:p/>
@@ -57,8 +39,35 @@
       <w:r>
         <w:rPr>
           <w:b/>
+          <w:color w:val="1F4E79"/>
+          <w:sz w:val="28"/>
         </w:rPr>
-        <w:t>Key Highlights:</w:t>
+        <w:t>1. Executive Summary</w:t>
+      </w:r>
+    </w:p>
+    <w:p>
+      <w:r>
+        <w:t>Group revenue for Q1 FY26 closed at USD 297.6M, +4.2% versus plan and +6.8% versus Q1 FY25, driven by stronger throughput at Site Delta (Asia-Pacific) and continued recovery at the Detroit specialty-chemicals plant. Group EBITDA of USD 46.1M (margin 15.5%) was 3.1% ahead of plan despite higher feedstock costs, reflecting disciplined fixed-cost management and favourable product mix.</w:t>
+      </w:r>
+    </w:p>
+    <w:p>
+      <w:r>
+        <w:t>Three items require Board attention: (i) Site Epsilon (APAC) is materially below plan on both throughput and EBITDA — a recovery plan is being finalised; (ii) Property division saw a 12-day slip in the Riverside Phase 3 launch; (iii) Group Scope 1+2 emissions intensity ticked up 1.8% vs the FY25 baseline driven by an unplanned diesel-genset run at Site Beta during a grid outage.</w:t>
+      </w:r>
+    </w:p>
+    <w:p>
+      <w:r>
+        <w:rPr>
+          <w:b/>
+          <w:color w:val="1F4E79"/>
+          <w:sz w:val="28"/>
+        </w:rPr>
+        <w:t>2. Industrial Operations</w:t>
+      </w:r>
+    </w:p>
+    <w:p>
+      <w:r>
+        <w:t>Industrial Operations delivered Q1 throughput of 234.7 kt across five sites, up 3.4% sequentially. Group yield held steady at 22.3% (FY25: 22.1%). Highlights:</w:t>
       </w:r>
     </w:p>
     <w:p>
@@ -66,7 +75,7 @@
         <w:pStyle w:val="ListBullet"/>
       </w:pPr>
       <w:r>
-        <w:t>Group CPO production: 16,600 tonnes (Q1 2025), -2.1% vs Q1 2024</w:t>
+        <w:t>Site Alpha (North America): Throughput 55.4 kt (+2.6% vs plan). Yield 22.4%. EBITDA margin 16.4%. New conveyor automation delivered 1.2pp OEE improvement.</w:t>
       </w:r>
     </w:p>
     <w:p>
@@ -74,7 +83,7 @@
         <w:pStyle w:val="ListBullet"/>
       </w:pPr>
       <w:r>
-        <w:t>Malaysia division OER: 19.6% average — 2 estates in Pahang below target</w:t>
+        <w:t>Site Beta (North America): Throughput 48.7 kt (+0.8% vs plan). Yield 21.9%. Brief grid outage in early March triggered diesel-genset use — investigated under UC9.</w:t>
       </w:r>
     </w:p>
     <w:p>
@@ -82,7 +91,7 @@
         <w:pStyle w:val="ListBullet"/>
       </w:pPr>
       <w:r>
-        <w:t>Indonesia division OER: 18.9% — Simalungun Estate flagged as CRITICAL at 17.6%</w:t>
+        <w:t>Site Gamma (Europe): Throughput 36.3 kt (+1.4% vs plan). Yield 23.1% — best in group. Holds dual ISO 14001 + ISCC certification.</w:t>
       </w:r>
     </w:p>
     <w:p>
@@ -90,7 +99,7 @@
         <w:pStyle w:val="ListBullet"/>
       </w:pPr>
       <w:r>
-        <w:t>Liberia division: On track, OER at 19.8%, weather conditions favourable</w:t>
+        <w:t>Site Delta (Asia-Pacific): Throughput 60.7 kt (+5.2% vs plan). Strong demand pull from regional manufacturing customers. EBITDA USD 12.4M.</w:t>
       </w:r>
     </w:p>
     <w:p>
@@ -98,7 +107,22 @@
         <w:pStyle w:val="ListBullet"/>
       </w:pPr>
       <w:r>
-        <w:t>Manufacturing (Oleochemicals): Revenue MYR 680M, operating margin 14.2%</w:t>
+        <w:t>Site Epsilon (Asia-Pacific): Throughput 28.3 kt (-6.1% vs plan). Two unplanned shutdowns (feedstock-quality issue, then planned-but-extended maintenance). Recovery plan: A&amp;B feedstock blending trial begins April; targeted Q2 throughput recovery to plan level.</w:t>
+      </w:r>
+    </w:p>
+    <w:p>
+      <w:r>
+        <w:rPr>
+          <w:b/>
+          <w:color w:val="1F4E79"/>
+          <w:sz w:val="28"/>
+        </w:rPr>
+        <w:t>3. Manufacturing &amp; Specialty Chemicals</w:t>
+      </w:r>
+    </w:p>
+    <w:p>
+      <w:r>
+        <w:t>Specialty Chemicals delivered Q1 revenue of USD 138.4M (+5.7% vs plan), benefiting from firm pricing in coatings and lubricant additives. EBITDA margin 16.8%, up 0.6pp sequentially. Detroit Phase-3 expansion remains on schedule for FY27 commissioning; Q1 capex spend USD 28.4M against budget USD 31.2M.</w:t>
       </w:r>
     </w:p>
     <w:p>
@@ -106,47 +130,7 @@
         <w:pStyle w:val="ListBullet"/>
       </w:pPr>
       <w:r>
-        <w:t>Property division: MYR 180M billings, 89% take-up rate at Contoso Heights Ipoh</w:t>
-      </w:r>
-    </w:p>
-    <w:p/>
-    <w:p>
-      <w:pPr>
-        <w:pStyle w:val="Heading1"/>
-      </w:pPr>
-      <w:r>
-        <w:rPr>
-          <w:color w:val="1F5C2E"/>
-        </w:rPr>
-        <w:t>2. Plantation Division Performance</w:t>
-      </w:r>
-    </w:p>
-    <w:p>
-      <w:pPr>
-        <w:pStyle w:val="Heading2"/>
-      </w:pPr>
-      <w:r>
-        <w:rPr>
-          <w:color w:val="1F5C2E"/>
-        </w:rPr>
-        <w:t>2.1 Malaysia Operations</w:t>
-      </w:r>
-    </w:p>
-    <w:p>
-      <w:r>
-        <w:rPr>
-          <w:b w:val="0"/>
-        </w:rPr>
-        <w:t>The Malaysia plantation division manages a total of 10,600 mature hectares across Sabah, Pahang, and Perak. Q1 FFB production totalled 43,235 tonnes.</w:t>
-      </w:r>
-    </w:p>
-    <w:p/>
-    <w:p>
-      <w:r>
-        <w:rPr>
-          <w:b/>
-        </w:rPr>
-        <w:t>Sabah Region:</w:t>
+        <w:t>Detroit Plant: 73.6 kt produced. OEE 91.3%. Phase-3 capex on schedule (62% complete).</w:t>
       </w:r>
     </w:p>
     <w:p>
@@ -154,7 +138,7 @@
         <w:pStyle w:val="ListBullet"/>
       </w:pPr>
       <w:r>
-        <w:t>Lahad Datu Estate remains the highest performer: OER 21.3%, FFB/ha 16.25</w:t>
+        <w:t>Pittsburgh Plant: 58.2 kt produced. OEE 88.7%. Polymer additive launch delivered USD 4.2M of incremental Q1 revenue.</w:t>
       </w:r>
     </w:p>
     <w:p>
@@ -162,7 +146,22 @@
         <w:pStyle w:val="ListBullet"/>
       </w:pPr>
       <w:r>
-        <w:t>Kinabatangan Estate on target at 20.8% OER in March</w:t>
+        <w:t>Düsseldorf Plant: 33.9 kt produced. OEE 92.1% — sector-leading. CBAM readiness assessment closed Q1 with zero gaps.</w:t>
+      </w:r>
+    </w:p>
+    <w:p>
+      <w:r>
+        <w:rPr>
+          <w:b/>
+          <w:color w:val="1F4E79"/>
+          <w:sz w:val="28"/>
+        </w:rPr>
+        <w:t>4. Property — Contoso Land</w:t>
+      </w:r>
+    </w:p>
+    <w:p>
+      <w:r>
+        <w:t>Contoso Land Q1 revenue USD 41.2M (+1.1% vs plan). Riverside Phase 3 (mixed-use, 38 acres, residential + retail) launch slipped from 18 March to 30 March owing to a final permitting clarification with the city. Sales conversion at preview event: 41% of allocated units (target 35%). Pre-bookings cover 62% of Phase 3 inventory.</w:t>
       </w:r>
     </w:p>
     <w:p>
@@ -170,16 +169,7 @@
         <w:pStyle w:val="ListBullet"/>
       </w:pPr>
       <w:r>
-        <w:t>Sandakan Estate: OER 17.9% in February — below 18% threshold; corrective harvesting schedule implemented</w:t>
-      </w:r>
-    </w:p>
-    <w:p/>
-    <w:p>
-      <w:r>
-        <w:rPr>
-          <w:b/>
-        </w:rPr>
-        <w:t>Pahang Region:</w:t>
+        <w:t>Land bank: 1,840 active acres (no change vs Q4 FY25).</w:t>
       </w:r>
     </w:p>
     <w:p>
@@ -187,7 +177,7 @@
         <w:pStyle w:val="ListBullet"/>
       </w:pPr>
       <w:r>
-        <w:t>Temerloh Estate: CRITICAL status — OER averaging 17.5% across Q1; root cause identified as labour shortage and suboptimal harvest rotation</w:t>
+        <w:t>Unbilled sales: USD 312M (covers 14 months of recognised revenue at current run rate).</w:t>
       </w:r>
     </w:p>
     <w:p>
@@ -195,7 +185,27 @@
         <w:pStyle w:val="ListBullet"/>
       </w:pPr>
       <w:r>
-        <w:t>Recommended action: Increase harvesting crew by 15%, revise crop census cycle to every 10 days</w:t>
+        <w:t>Riverside Phase 3 Investment Memorandum and Tech DD pack issued to capital partners (covered in Runbook UC3).</w:t>
+      </w:r>
+    </w:p>
+    <w:p>
+      <w:r>
+        <w:rPr>
+          <w:b/>
+          <w:color w:val="1F4E79"/>
+          <w:sz w:val="28"/>
+        </w:rPr>
+        <w:t>5. Group Sustainability &amp; Risk</w:t>
+      </w:r>
+    </w:p>
+    <w:p>
+      <w:r>
+        <w:t>Group Scope 1+2 emissions for Q1 closed at 89.4 ktCO2e (intensity 0.381 tCO2e per tonne output — up 1.8% vs FY25 baseline of 0.374). Driver: one-off diesel-genset run at Site Beta and weather-related haulage spike at Site Delta. Scope 3 estimated at 103.4 ktCO2e (-0.7% vs FY25). CBAM and CDP submissions for FY25 reporting cycle are on track for May filing.</w:t>
+      </w:r>
+    </w:p>
+    <w:p>
+      <w:r>
+        <w:t>Top enterprise risks (RAG):</w:t>
       </w:r>
     </w:p>
     <w:p>
@@ -203,16 +213,7 @@
         <w:pStyle w:val="ListBullet"/>
       </w:pPr>
       <w:r>
-        <w:t>Raub Estate: Recovering — OER back to 19.0% in March after weather disruption in February</w:t>
-      </w:r>
-    </w:p>
-    <w:p/>
-    <w:p>
-      <w:r>
-        <w:rPr>
-          <w:b/>
-        </w:rPr>
-        <w:t>Perak Region:</w:t>
+        <w:t>🟢 Liquidity / refinancing — USD 480M revolving facility renewed Feb 2026 at +25 bps.</w:t>
       </w:r>
     </w:p>
     <w:p>
@@ -220,27 +221,7 @@
         <w:pStyle w:val="ListBullet"/>
       </w:pPr>
       <w:r>
-        <w:t>Teluk Intan Estate: Consistently above 20% OER; best practice model for other estates</w:t>
-      </w:r>
-    </w:p>
-    <w:p/>
-    <w:p>
-      <w:pPr>
-        <w:pStyle w:val="Heading2"/>
-      </w:pPr>
-      <w:r>
-        <w:rPr>
-          <w:color w:val="1F5C2E"/>
-        </w:rPr>
-        <w:t>2.2 Indonesia Operations (North Sumatra)</w:t>
-      </w:r>
-    </w:p>
-    <w:p>
-      <w:r>
-        <w:rPr>
-          <w:b w:val="0"/>
-        </w:rPr>
-        <w:t>Three estates operating in North Sumatra with a combined 9,400 mature hectares. Total Q1 FFB: 34,500 tonnes.</w:t>
+        <w:t>🟡 Site Epsilon throughput recovery — recovery plan in execution; risk of Q2 plan miss.</w:t>
       </w:r>
     </w:p>
     <w:p>
@@ -248,7 +229,7 @@
         <w:pStyle w:val="ListBullet"/>
       </w:pPr>
       <w:r>
-        <w:t>Deli Serdang Estate: Top performer at 20.7% OER — exceeds regional target</w:t>
+        <w:t>🟡 CBAM scope expansion — preparing FY27 product-coverage list with Group Tax.</w:t>
       </w:r>
     </w:p>
     <w:p>
@@ -256,503 +237,567 @@
         <w:pStyle w:val="ListBullet"/>
       </w:pPr>
       <w:r>
-        <w:t>Asahan Estate: Below target at 18.4%; agronomy review initiated for soil nutrient management</w:t>
-      </w:r>
-    </w:p>
-    <w:p>
-      <w:pPr>
-        <w:pStyle w:val="ListBullet"/>
-      </w:pPr>
-      <w:r>
-        <w:t>Simalungun Estate: CRITICAL — OER averaging 17.6% across Q1; new estate manager appointed effective April 2025</w:t>
-      </w:r>
-    </w:p>
-    <w:p>
-      <w:pPr>
-        <w:pStyle w:val="ListBullet"/>
-      </w:pPr>
-      <w:r>
-        <w:t>Key challenge: Rising fertiliser costs (+12% YoY) impacting cost per tonne of CPO</w:t>
-      </w:r>
-    </w:p>
-    <w:p/>
-    <w:p>
-      <w:pPr>
-        <w:pStyle w:val="Heading2"/>
-      </w:pPr>
-      <w:r>
-        <w:rPr>
-          <w:color w:val="1F5C2E"/>
-        </w:rPr>
-        <w:t>2.3 Liberia Operations</w:t>
+        <w:t>🔴 Cyber — three suspicious-login events at Pittsburgh in March; SOC under remediation.</w:t>
       </w:r>
     </w:p>
     <w:p>
       <w:r>
         <w:rPr>
-          <w:b w:val="0"/>
+          <w:b/>
+          <w:color w:val="1F4E79"/>
+          <w:sz w:val="28"/>
         </w:rPr>
-        <w:t>One estate operating in Montserrado with 2,200 mature hectares. Q1 FFB: 8,350 tonnes.</w:t>
+        <w:t>6. Action Items</w:t>
       </w:r>
     </w:p>
+    <w:tbl>
+      <w:tblPr>
+        <w:tblStyle w:val="LightGrid-Accent1"/>
+        <w:tblW w:type="auto" w:w="0"/>
+        <w:tblLook w:firstColumn="1" w:firstRow="1" w:lastColumn="0" w:lastRow="0" w:noHBand="0" w:noVBand="1" w:val="04A0"/>
+      </w:tblPr>
+      <w:tblGrid>
+        <w:gridCol w:w="2160"/>
+        <w:gridCol w:w="2160"/>
+        <w:gridCol w:w="2160"/>
+        <w:gridCol w:w="2160"/>
+      </w:tblGrid>
+      <w:tr>
+        <w:tc>
+          <w:tcPr>
+            <w:tcW w:type="dxa" w:w="2160"/>
+          </w:tcPr>
+          <w:p>
+            <w:r>
+              <w:t>Action ID</w:t>
+            </w:r>
+          </w:p>
+        </w:tc>
+        <w:tc>
+          <w:tcPr>
+            <w:tcW w:type="dxa" w:w="2160"/>
+          </w:tcPr>
+          <w:p>
+            <w:r>
+              <w:t>Action</w:t>
+            </w:r>
+          </w:p>
+        </w:tc>
+        <w:tc>
+          <w:tcPr>
+            <w:tcW w:type="dxa" w:w="2160"/>
+          </w:tcPr>
+          <w:p>
+            <w:r>
+              <w:t>Owner</w:t>
+            </w:r>
+          </w:p>
+        </w:tc>
+        <w:tc>
+          <w:tcPr>
+            <w:tcW w:type="dxa" w:w="2160"/>
+          </w:tcPr>
+          <w:p>
+            <w:r>
+              <w:t>Due</w:t>
+            </w:r>
+          </w:p>
+        </w:tc>
+      </w:tr>
+      <w:tr>
+        <w:tc>
+          <w:tcPr>
+            <w:tcW w:type="dxa" w:w="2160"/>
+          </w:tcPr>
+          <w:p>
+            <w:r>
+              <w:t>OPS-26-031</w:t>
+            </w:r>
+          </w:p>
+        </w:tc>
+        <w:tc>
+          <w:tcPr>
+            <w:tcW w:type="dxa" w:w="2160"/>
+          </w:tcPr>
+          <w:p>
+            <w:r>
+              <w:t>Finalise Site Epsilon recovery plan</w:t>
+            </w:r>
+          </w:p>
+        </w:tc>
+        <w:tc>
+          <w:tcPr>
+            <w:tcW w:type="dxa" w:w="2160"/>
+          </w:tcPr>
+          <w:p>
+            <w:r>
+              <w:t>COO Industrial</w:t>
+            </w:r>
+          </w:p>
+        </w:tc>
+        <w:tc>
+          <w:tcPr>
+            <w:tcW w:type="dxa" w:w="2160"/>
+          </w:tcPr>
+          <w:p>
+            <w:r>
+              <w:t>30 Apr 2026</w:t>
+            </w:r>
+          </w:p>
+        </w:tc>
+      </w:tr>
+      <w:tr>
+        <w:tc>
+          <w:tcPr>
+            <w:tcW w:type="dxa" w:w="2160"/>
+          </w:tcPr>
+          <w:p>
+            <w:r>
+              <w:t>OPS-26-032</w:t>
+            </w:r>
+          </w:p>
+        </w:tc>
+        <w:tc>
+          <w:tcPr>
+            <w:tcW w:type="dxa" w:w="2160"/>
+          </w:tcPr>
+          <w:p>
+            <w:r>
+              <w:t>Investigate Site Beta diesel-genset run vs grid SLA</w:t>
+            </w:r>
+          </w:p>
+        </w:tc>
+        <w:tc>
+          <w:tcPr>
+            <w:tcW w:type="dxa" w:w="2160"/>
+          </w:tcPr>
+          <w:p>
+            <w:r>
+              <w:t>Site Beta GM</w:t>
+            </w:r>
+          </w:p>
+        </w:tc>
+        <w:tc>
+          <w:tcPr>
+            <w:tcW w:type="dxa" w:w="2160"/>
+          </w:tcPr>
+          <w:p>
+            <w:r>
+              <w:t>15 Apr 2026</w:t>
+            </w:r>
+          </w:p>
+        </w:tc>
+      </w:tr>
+      <w:tr>
+        <w:tc>
+          <w:tcPr>
+            <w:tcW w:type="dxa" w:w="2160"/>
+          </w:tcPr>
+          <w:p>
+            <w:r>
+              <w:t>PROP-26-014</w:t>
+            </w:r>
+          </w:p>
+        </w:tc>
+        <w:tc>
+          <w:tcPr>
+            <w:tcW w:type="dxa" w:w="2160"/>
+          </w:tcPr>
+          <w:p>
+            <w:r>
+              <w:t>Close Riverside Phase 3 permitting clarifications</w:t>
+            </w:r>
+          </w:p>
+        </w:tc>
+        <w:tc>
+          <w:tcPr>
+            <w:tcW w:type="dxa" w:w="2160"/>
+          </w:tcPr>
+          <w:p>
+            <w:r>
+              <w:t>Property COO</w:t>
+            </w:r>
+          </w:p>
+        </w:tc>
+        <w:tc>
+          <w:tcPr>
+            <w:tcW w:type="dxa" w:w="2160"/>
+          </w:tcPr>
+          <w:p>
+            <w:r>
+              <w:t>07 Apr 2026</w:t>
+            </w:r>
+          </w:p>
+        </w:tc>
+      </w:tr>
+      <w:tr>
+        <w:tc>
+          <w:tcPr>
+            <w:tcW w:type="dxa" w:w="2160"/>
+          </w:tcPr>
+          <w:p>
+            <w:r>
+              <w:t>SUS-26-009</w:t>
+            </w:r>
+          </w:p>
+        </w:tc>
+        <w:tc>
+          <w:tcPr>
+            <w:tcW w:type="dxa" w:w="2160"/>
+          </w:tcPr>
+          <w:p>
+            <w:r>
+              <w:t>Validate Q1 emissions intensity uplift against FY25 base</w:t>
+            </w:r>
+          </w:p>
+        </w:tc>
+        <w:tc>
+          <w:tcPr>
+            <w:tcW w:type="dxa" w:w="2160"/>
+          </w:tcPr>
+          <w:p>
+            <w:r>
+              <w:t>Group Sustainability</w:t>
+            </w:r>
+          </w:p>
+        </w:tc>
+        <w:tc>
+          <w:tcPr>
+            <w:tcW w:type="dxa" w:w="2160"/>
+          </w:tcPr>
+          <w:p>
+            <w:r>
+              <w:t>30 Apr 2026</w:t>
+            </w:r>
+          </w:p>
+        </w:tc>
+      </w:tr>
+      <w:tr>
+        <w:tc>
+          <w:tcPr>
+            <w:tcW w:type="dxa" w:w="2160"/>
+          </w:tcPr>
+          <w:p>
+            <w:r>
+              <w:t>CYBER-26-005</w:t>
+            </w:r>
+          </w:p>
+        </w:tc>
+        <w:tc>
+          <w:tcPr>
+            <w:tcW w:type="dxa" w:w="2160"/>
+          </w:tcPr>
+          <w:p>
+            <w:r>
+              <w:t>Complete Pittsburgh SOC remediation and 30-day monitoring</w:t>
+            </w:r>
+          </w:p>
+        </w:tc>
+        <w:tc>
+          <w:tcPr>
+            <w:tcW w:type="dxa" w:w="2160"/>
+          </w:tcPr>
+          <w:p>
+            <w:r>
+              <w:t>CISO</w:t>
+            </w:r>
+          </w:p>
+        </w:tc>
+        <w:tc>
+          <w:tcPr>
+            <w:tcW w:type="dxa" w:w="2160"/>
+          </w:tcPr>
+          <w:p>
+            <w:r>
+              <w:t>30 Apr 2026</w:t>
+            </w:r>
+          </w:p>
+        </w:tc>
+      </w:tr>
+      <w:tr>
+        <w:tc>
+          <w:tcPr>
+            <w:tcW w:type="dxa" w:w="2160"/>
+          </w:tcPr>
+          <w:p>
+            <w:r>
+              <w:t>FIN-26-022</w:t>
+            </w:r>
+          </w:p>
+        </w:tc>
+        <w:tc>
+          <w:tcPr>
+            <w:tcW w:type="dxa" w:w="2160"/>
+          </w:tcPr>
+          <w:p>
+            <w:r>
+              <w:t>Prepare draft NYSE Q1 filing pack for Audit Committee</w:t>
+            </w:r>
+          </w:p>
+        </w:tc>
+        <w:tc>
+          <w:tcPr>
+            <w:tcW w:type="dxa" w:w="2160"/>
+          </w:tcPr>
+          <w:p>
+            <w:r>
+              <w:t>Group Controller</w:t>
+            </w:r>
+          </w:p>
+        </w:tc>
+        <w:tc>
+          <w:tcPr>
+            <w:tcW w:type="dxa" w:w="2160"/>
+          </w:tcPr>
+          <w:p>
+            <w:r>
+              <w:t>20 Apr 2026</w:t>
+            </w:r>
+          </w:p>
+        </w:tc>
+      </w:tr>
+    </w:tbl>
     <w:p>
-      <w:pPr>
-        <w:pStyle w:val="ListBullet"/>
-      </w:pPr>
       <w:r>
-        <w:t>Monrovia Estate: On track — OER at 19.8%, targeting 20.5% by Q3 as new palms reach peak maturity</w:t>
-      </w:r>
-    </w:p>
-    <w:p>
-      <w:pPr>
-        <w:pStyle w:val="ListBullet"/>
-      </w:pPr>
-      <w:r>
-        <w:t>RSPO certification audit scheduled for June 2025 — documentation preparation underway</w:t>
-      </w:r>
-    </w:p>
-    <w:p>
-      <w:pPr>
-        <w:pStyle w:val="ListBullet"/>
-      </w:pPr>
-      <w:r>
-        <w:t>Infrastructure investment: MYR 4.2M approved for new palm oil mini-mill (commissioning Q3 2025)</w:t>
-      </w:r>
-    </w:p>
-    <w:p/>
-    <w:p>
-      <w:pPr>
-        <w:pStyle w:val="Heading1"/>
-      </w:pPr>
-      <w:r>
-        <w:rPr>
-          <w:color w:val="1F5C2E"/>
-        </w:rPr>
-        <w:t>3. Q1 Operations Review — Meeting Notes (For Teams Recap Demo)</w:t>
+        <w:br w:type="page"/>
       </w:r>
     </w:p>
     <w:p>
       <w:r>
         <w:rPr>
-          <w:b w:val="0"/>
+          <w:b/>
+          <w:color w:val="1F4E79"/>
+          <w:sz w:val="28"/>
         </w:rPr>
-        <w:t>[TRANSCRIPT — Contoso Plantation Q1 Operations Review Meeting | 15 March 2025 | Teams Recording]</w:t>
+        <w:t>7. Group Operations Council — 2 April 2026 — Transcript Excerpt</w:t>
       </w:r>
     </w:p>
-    <w:p/>
     <w:p>
       <w:r>
-        <w:rPr>
-          <w:b w:val="0"/>
-        </w:rPr>
-        <w:t>Attendees: Dato Ahmad Razali (CEO), Lim Siew Ling (COO), Raj Kumar (Head of Plantation - Malaysia), Amir Hamzah (Head of Plantation - Indonesia), Sarah Abdullah (Sustainability Manager), David Tan (CFO)</w:t>
+        <w:t>Attendees: Siew Ling (COO), Marcus Chen (CFO), David Patel (Group Sustainability), Aisha Rahman (Property COO), Tom Becker (CISO).</w:t>
       </w:r>
     </w:p>
-    <w:p/>
     <w:p>
       <w:r>
-        <w:rPr>
-          <w:b w:val="0"/>
-        </w:rPr>
-        <w:t>AGENDA ITEM 1 — Q1 Yield Performance Review</w:t>
+        <w:t>Format: lightly edited, timestamps in [HH:MM].</w:t>
       </w:r>
     </w:p>
     <w:p>
       <w:r>
         <w:rPr>
-          <w:b w:val="0"/>
+          <w:color w:val="808080"/>
+          <w:sz w:val="18"/>
         </w:rPr>
-        <w:t>Ahmad: Let's start with the yield numbers. Raj, can you walk us through Malaysia performance?</w:t>
+        <w:t xml:space="preserve">[09:02]  </w:t>
+      </w:r>
+      <w:r>
+        <w:rPr>
+          <w:b/>
+        </w:rPr>
+        <w:t xml:space="preserve">Siew Ling: </w:t>
+      </w:r>
+      <w:r>
+        <w:t>Let's start with Industrial. Where are we ending Q1?</w:t>
       </w:r>
     </w:p>
     <w:p>
       <w:r>
         <w:rPr>
-          <w:b w:val="0"/>
+          <w:color w:val="808080"/>
+          <w:sz w:val="18"/>
         </w:rPr>
-        <w:t>Raj: Overall Q1 is mixed. Sabah is doing well — Lahad Datu at 21.3%, Kinabatangan steady. The problem is Pahang. Temerloh is at 17.5% average — that's three months in a row below threshold. We've identified the root cause as a labour rotation issue combined with the wet season.</w:t>
+        <w:t xml:space="preserve">[09:03]  </w:t>
+      </w:r>
+      <w:r>
+        <w:rPr>
+          <w:b/>
+        </w:rPr>
+        <w:t xml:space="preserve">Marcus Chen: </w:t>
+      </w:r>
+      <w:r>
+        <w:t>Group revenue 297.6M, plus 4.2 against plan. EBITDA 46.1M. The standout is Delta — APAC pull stronger than we modelled.</w:t>
       </w:r>
     </w:p>
     <w:p>
       <w:r>
         <w:rPr>
-          <w:b w:val="0"/>
+          <w:color w:val="808080"/>
+          <w:sz w:val="18"/>
         </w:rPr>
-        <w:t>Ahmad: What's the action plan?</w:t>
+        <w:t xml:space="preserve">[09:05]  </w:t>
+      </w:r>
+      <w:r>
+        <w:rPr>
+          <w:b/>
+        </w:rPr>
+        <w:t xml:space="preserve">Siew Ling: </w:t>
+      </w:r>
+      <w:r>
+        <w:t>Good. Epsilon?</w:t>
       </w:r>
     </w:p>
     <w:p>
       <w:r>
         <w:rPr>
-          <w:b w:val="0"/>
+          <w:color w:val="808080"/>
+          <w:sz w:val="18"/>
         </w:rPr>
-        <w:t>Raj: We're adding 15 additional harvesters effective 1 April, revising the harvest rotation to 10-day cycles, and I'll personally visit the estate on 20 March for a ground inspection.</w:t>
+        <w:t xml:space="preserve">[09:05]  </w:t>
+      </w:r>
+      <w:r>
+        <w:rPr>
+          <w:b/>
+        </w:rPr>
+        <w:t xml:space="preserve">Marcus Chen: </w:t>
+      </w:r>
+      <w:r>
+        <w:t>Below plan on both throughput and EBITDA. Two unplanned shutdowns. Recovery plan locked next week.</w:t>
       </w:r>
     </w:p>
     <w:p>
       <w:r>
         <w:rPr>
-          <w:b w:val="0"/>
+          <w:color w:val="808080"/>
+          <w:sz w:val="18"/>
         </w:rPr>
-        <w:t>Ahmad: Good. Amir, Indonesia?</w:t>
+        <w:t xml:space="preserve">[09:07]  </w:t>
+      </w:r>
+      <w:r>
+        <w:rPr>
+          <w:b/>
+        </w:rPr>
+        <w:t xml:space="preserve">Siew Ling: </w:t>
+      </w:r>
+      <w:r>
+        <w:t>I want a Board-ready memo on Epsilon by end of April. David, sustainability?</w:t>
       </w:r>
     </w:p>
     <w:p>
       <w:r>
         <w:rPr>
-          <w:b w:val="0"/>
+          <w:color w:val="808080"/>
+          <w:sz w:val="18"/>
         </w:rPr>
-        <w:t>Amir: Deli Serdang continues to be our best performer at 20.7%. I'm proud of that team. But Simalungun is a concern — 17.6% OER. The previous estate manager left in February and we had a gap. New manager starts Monday. I expect recovery by Q2.</w:t>
+        <w:t xml:space="preserve">[09:08]  </w:t>
       </w:r>
-    </w:p>
-    <w:p/>
-    <w:p>
       <w:r>
         <w:rPr>
-          <w:b w:val="0"/>
+          <w:b/>
         </w:rPr>
-        <w:t>AGENDA ITEM 2 — Sustainability Update</w:t>
+        <w:t xml:space="preserve">David Patel: </w:t>
+      </w:r>
+      <w:r>
+        <w:t>Q1 intensity ticked up 1.8 percent. Two drivers — one-off diesel run at Beta during the grid outage, and the haulage spike at Delta. Both mechanically explained, but we need to validate the maths against FY25 base before we go to CDP.</w:t>
       </w:r>
     </w:p>
     <w:p>
       <w:r>
         <w:rPr>
-          <w:b w:val="0"/>
+          <w:color w:val="808080"/>
+          <w:sz w:val="18"/>
         </w:rPr>
-        <w:t>Sarah: RSPO audit for Liberia is on track for June. Main gap is traceability documentation — we need estate-level GPS boundary data for all plots. I need Raj and Amir to submit updated maps by end of April.</w:t>
+        <w:t xml:space="preserve">[09:10]  </w:t>
+      </w:r>
+      <w:r>
+        <w:rPr>
+          <w:b/>
+        </w:rPr>
+        <w:t xml:space="preserve">Siew Ling: </w:t>
+      </w:r>
+      <w:r>
+        <w:t>Validate by 30 April. Aisha — Riverside?</w:t>
       </w:r>
     </w:p>
     <w:p>
       <w:r>
         <w:rPr>
-          <w:b w:val="0"/>
+          <w:color w:val="808080"/>
+          <w:sz w:val="18"/>
         </w:rPr>
-        <w:t>Ahmad: Mark that as action item. Also, EUDR — where are we?</w:t>
+        <w:t xml:space="preserve">[09:11]  </w:t>
+      </w:r>
+      <w:r>
+        <w:rPr>
+          <w:b/>
+        </w:rPr>
+        <w:t xml:space="preserve">Aisha Rahman: </w:t>
+      </w:r>
+      <w:r>
+        <w:t>Phase 3 launch slipped 12 days. Permitting clarification. Pre-bookings 62 percent of inventory. We're fine commercially but we missed our launch window.</w:t>
       </w:r>
     </w:p>
     <w:p>
       <w:r>
         <w:rPr>
-          <w:b w:val="0"/>
+          <w:color w:val="808080"/>
+          <w:sz w:val="18"/>
         </w:rPr>
-        <w:t>Sarah: We've engaged a consultant. The main challenge is proving deforestation-free supply chain for all our FFB suppliers. We're targeting full compliance by December 2025. It's going to require significant documentation work.</w:t>
+        <w:t xml:space="preserve">[09:13]  </w:t>
       </w:r>
-    </w:p>
-    <w:p/>
-    <w:p>
       <w:r>
         <w:rPr>
-          <w:b w:val="0"/>
+          <w:b/>
         </w:rPr>
-        <w:t>AGENDA ITEM 3 — Financial Performance</w:t>
+        <w:t xml:space="preserve">Siew Ling: </w:t>
+      </w:r>
+      <w:r>
+        <w:t>Tom — cyber?</w:t>
       </w:r>
     </w:p>
     <w:p>
       <w:r>
         <w:rPr>
-          <w:b w:val="0"/>
+          <w:color w:val="808080"/>
+          <w:sz w:val="18"/>
         </w:rPr>
-        <w:t>David: Revenue is MYR 2.1B, up 4.2% YoY. CPO prices are holding well at MYR 4,250/tonne. Manufacturing margins are healthy at 14.2%. The concern is Sumatra cost per tonne — it's up 8% due to fertiliser and labour cost inflation.</w:t>
+        <w:t xml:space="preserve">[09:14]  </w:t>
+      </w:r>
+      <w:r>
+        <w:rPr>
+          <w:b/>
+        </w:rPr>
+        <w:t xml:space="preserve">Tom Becker: </w:t>
+      </w:r>
+      <w:r>
+        <w:t>Three suspicious-login events at Pittsburgh in March. SOC is on it. Targeting full remediation and 30-day monitoring close-out by end of April.</w:t>
       </w:r>
     </w:p>
     <w:p>
       <w:r>
         <w:rPr>
-          <w:b w:val="0"/>
+          <w:color w:val="808080"/>
+          <w:sz w:val="18"/>
         </w:rPr>
-        <w:t>Ahmad: We need to offset that with yield improvement. Amir, that needs to be your focus for Q2.</w:t>
+        <w:t xml:space="preserve">[09:16]  </w:t>
       </w:r>
-    </w:p>
-    <w:p/>
-    <w:p>
       <w:r>
         <w:rPr>
-          <w:b w:val="0"/>
+          <w:b/>
         </w:rPr>
-        <w:t>ACTION ITEMS SUMMARY:</w:t>
+        <w:t xml:space="preserve">Siew Ling: </w:t>
       </w:r>
-    </w:p>
-    <w:p>
-      <w:pPr>
-        <w:pStyle w:val="ListBullet"/>
-      </w:pPr>
       <w:r>
-        <w:t>Raj Kumar — Increase Temerloh harvesting crew by 15% — Deadline: 1 April 2025</w:t>
-      </w:r>
-    </w:p>
-    <w:p>
-      <w:pPr>
-        <w:pStyle w:val="ListBullet"/>
-      </w:pPr>
-      <w:r>
-        <w:t>Raj Kumar &amp; Amir Hamzah — Submit updated GPS estate boundary maps for RSPO — Deadline: 30 April 2025</w:t>
-      </w:r>
-    </w:p>
-    <w:p>
-      <w:pPr>
-        <w:pStyle w:val="ListBullet"/>
-      </w:pPr>
-      <w:r>
-        <w:t>Amir Hamzah — Simalungun estate recovery plan — Deadline: 30 April 2025</w:t>
-      </w:r>
-    </w:p>
-    <w:p>
-      <w:pPr>
-        <w:pStyle w:val="ListBullet"/>
-      </w:pPr>
-      <w:r>
-        <w:t>Sarah Abdullah — Engage EUDR consultant for full compliance plan — Deadline: 15 April 2025</w:t>
-      </w:r>
-    </w:p>
-    <w:p>
-      <w:pPr>
-        <w:pStyle w:val="ListBullet"/>
-      </w:pPr>
-      <w:r>
-        <w:t>David Tan — Submit revised Q2 cost forecast factoring in fertiliser increases — Deadline: 10 April 2025</w:t>
+        <w:t>OK. I want this out as a package — exec summary, the segment view, sustainability ask, action list. Marcus, get me a draft by Wednesday.</w:t>
       </w:r>
     </w:p>
     <w:p>
       <w:r>
         <w:rPr>
-          <w:b w:val="0"/>
+          <w:color w:val="808080"/>
+          <w:sz w:val="18"/>
         </w:rPr>
-        <w:t>Next Meeting: 16 April 2025, 10:00 AM via Teams</w:t>
+        <w:t xml:space="preserve">[09:17]  </w:t>
+      </w:r>
+      <w:r>
+        <w:rPr>
+          <w:b/>
+        </w:rPr>
+        <w:t xml:space="preserve">Marcus Chen: </w:t>
+      </w:r>
+      <w:r>
+        <w:t>Will do.</w:t>
       </w:r>
     </w:p>
-    <w:p/>
-    <w:p>
-      <w:pPr>
-        <w:pStyle w:val="Heading1"/>
-      </w:pPr>
-      <w:r>
-        <w:rPr>
-          <w:color w:val="1F5C2E"/>
-        </w:rPr>
-        <w:t>4. Manufacturing Division — Oleochemicals</w:t>
-      </w:r>
-    </w:p>
-    <w:p>
-      <w:r>
-        <w:rPr>
-          <w:b w:val="0"/>
-        </w:rPr>
-        <w:t>Contoso Plantation's oleochemical manufacturing arm produced revenue of MYR 680 million in Q1 2025, representing 32% of group revenue. Operating margin improved to 14.2% (Q1 2024: 13.1%) driven by product mix optimisation and higher fatty acid demand from European personal care customers.</w:t>
-      </w:r>
-    </w:p>
-    <w:p>
-      <w:pPr>
-        <w:pStyle w:val="ListBullet"/>
-      </w:pPr>
-      <w:r>
-        <w:t>Key products: Fatty acids, glycerine, methyl esters, fatty alcohols</w:t>
-      </w:r>
-    </w:p>
-    <w:p>
-      <w:pPr>
-        <w:pStyle w:val="ListBullet"/>
-      </w:pPr>
-      <w:r>
-        <w:t>Key markets: Europe (42%), Asia Pacific (35%), Middle East &amp; Americas (23%)</w:t>
-      </w:r>
-    </w:p>
-    <w:p>
-      <w:pPr>
-        <w:pStyle w:val="ListBullet"/>
-      </w:pPr>
-      <w:r>
-        <w:t>New capacity: Phase 2 plant expansion in Klang underway — commissioning target Q4 2025</w:t>
-      </w:r>
-    </w:p>
-    <w:p>
-      <w:pPr>
-        <w:pStyle w:val="ListBullet"/>
-      </w:pPr>
-      <w:r>
-        <w:t>Sustainability milestone: 85% of oleochemical inputs sourced from RSPO-certified palm oil</w:t>
-      </w:r>
-    </w:p>
-    <w:p/>
-    <w:p>
-      <w:pPr>
-        <w:pStyle w:val="Heading1"/>
-      </w:pPr>
-      <w:r>
-        <w:rPr>
-          <w:color w:val="1F5C2E"/>
-        </w:rPr>
-        <w:t>5. Property Division — KLK Land</w:t>
-      </w:r>
-    </w:p>
-    <w:p>
-      <w:r>
-        <w:rPr>
-          <w:b w:val="0"/>
-        </w:rPr>
-        <w:t>The property division recorded billings of MYR 180 million in Q1 2025, with strong demand for landed residential products in Perak and Selangor.</w:t>
-      </w:r>
-    </w:p>
-    <w:p>
-      <w:pPr>
-        <w:pStyle w:val="ListBullet"/>
-      </w:pPr>
-      <w:r>
-        <w:t>Contoso Heights Ipoh: 89% take-up, final 48 units launched in March 2025</w:t>
-      </w:r>
-    </w:p>
-    <w:p>
-      <w:pPr>
-        <w:pStyle w:val="ListBullet"/>
-      </w:pPr>
-      <w:r>
-        <w:t>Contoso Residences Shah Alam: New launch — 120 units, 60% sold within 2 weeks</w:t>
-      </w:r>
-    </w:p>
-    <w:p>
-      <w:pPr>
-        <w:pStyle w:val="ListBullet"/>
-      </w:pPr>
-      <w:r>
-        <w:t>Land bank: 2,400 acres of developable land across Perak, Selangor, and Johor</w:t>
-      </w:r>
-    </w:p>
-    <w:p>
-      <w:pPr>
-        <w:pStyle w:val="ListBullet"/>
-      </w:pPr>
-      <w:r>
-        <w:t>GDV pipeline: MYR 3.8 billion over 5 years</w:t>
-      </w:r>
-    </w:p>
-    <w:p/>
-    <w:p>
-      <w:pPr>
-        <w:pStyle w:val="Heading1"/>
-      </w:pPr>
-      <w:r>
-        <w:rPr>
-          <w:color w:val="1F5C2E"/>
-        </w:rPr>
-        <w:t>6. Sustainability &amp; ESG Update</w:t>
-      </w:r>
-    </w:p>
-    <w:p>
-      <w:pPr>
-        <w:pStyle w:val="ListBullet"/>
-      </w:pPr>
-      <w:r>
-        <w:t>MSPO certification: 100% of Malaysia estates certified; Indonesia target by Q3 2025</w:t>
-      </w:r>
-    </w:p>
-    <w:p>
-      <w:pPr>
-        <w:pStyle w:val="ListBullet"/>
-      </w:pPr>
-      <w:r>
-        <w:t>RSPO: 78% of plantation area certified; Liberia audit in June 2025</w:t>
-      </w:r>
-    </w:p>
-    <w:p>
-      <w:pPr>
-        <w:pStyle w:val="ListBullet"/>
-      </w:pPr>
-      <w:r>
-        <w:t>Zero Burning Policy: Full compliance across all geographies</w:t>
-      </w:r>
-    </w:p>
-    <w:p>
-      <w:pPr>
-        <w:pStyle w:val="ListBullet"/>
-      </w:pPr>
-      <w:r>
-        <w:t>Carbon footprint: Group carbon intensity reduced 3.2% YoY</w:t>
-      </w:r>
-    </w:p>
-    <w:p>
-      <w:pPr>
-        <w:pStyle w:val="ListBullet"/>
-      </w:pPr>
-      <w:r>
-        <w:t>EUDR compliance: Project initiated; full supply chain traceability by December 2025</w:t>
-      </w:r>
-    </w:p>
-    <w:p>
-      <w:pPr>
-        <w:pStyle w:val="ListBullet"/>
-      </w:pPr>
-      <w:r>
-        <w:t>Social: 2,400 estate workers benefited from COLA increase effective 1 January 2025</w:t>
-      </w:r>
-    </w:p>
-    <w:p/>
-    <w:p>
-      <w:pPr>
-        <w:pStyle w:val="Heading1"/>
-      </w:pPr>
-      <w:r>
-        <w:rPr>
-          <w:color w:val="1F5C2E"/>
-        </w:rPr>
-        <w:t>7. Q2 2025 Outlook &amp; Key Priorities</w:t>
-      </w:r>
-    </w:p>
-    <w:p>
-      <w:pPr>
-        <w:pStyle w:val="ListBullet"/>
-      </w:pPr>
-      <w:r>
-        <w:t>CPO price assumption: MYR 4,100-4,400/tonne (stable outlook based on current supply-demand)</w:t>
-      </w:r>
-    </w:p>
-    <w:p>
-      <w:pPr>
-        <w:pStyle w:val="ListBullet"/>
-      </w:pPr>
-      <w:r>
-        <w:t>Yield recovery target: Malaysia OER to exceed 20.0% by end of Q2</w:t>
-      </w:r>
-    </w:p>
-    <w:p>
-      <w:pPr>
-        <w:pStyle w:val="ListBullet"/>
-      </w:pPr>
-      <w:r>
-        <w:t>Indonesia focus: Simalungun Estate OER to recover to 19.0% by June 2025</w:t>
-      </w:r>
-    </w:p>
-    <w:p>
-      <w:pPr>
-        <w:pStyle w:val="ListBullet"/>
-      </w:pPr>
-      <w:r>
-        <w:t>Manufacturing: Phase 2 expansion capex on track; no supply disruption expected</w:t>
-      </w:r>
-    </w:p>
-    <w:p>
-      <w:pPr>
-        <w:pStyle w:val="ListBullet"/>
-      </w:pPr>
-      <w:r>
-        <w:t>Property: Target MYR 200M billings in Q2 from new launches</w:t>
-      </w:r>
-    </w:p>
-    <w:p>
-      <w:pPr>
-        <w:pStyle w:val="ListBullet"/>
-      </w:pPr>
-      <w:r>
-        <w:t>Sustainability: Submit EUDR traceability documentation framework to Board by April 30</w:t>
-      </w:r>
-    </w:p>
-    <w:p>
-      <w:pPr>
-        <w:pStyle w:val="ListBullet"/>
-      </w:pPr>
-      <w:r>
-        <w:t>Digital: Evaluate M365 Copilot pilot for estate operations and finance team (10 users, 3 months)</w:t>
-      </w:r>
-    </w:p>
-    <w:p/>
     <w:sectPr>
       <w:pgSz w:w="12240" w:h="15840"/>
       <w:pgMar w:top="1440" w:right="1800" w:bottom="1440" w:left="1800" w:header="720" w:footer="720" w:gutter="0"/>
@@ -1126,6 +1171,10 @@
     <w:name w:val="Normal"/>
     <w:qFormat/>
     <w:rsid w:val="00FC693F"/>
+    <w:rPr>
+      <w:rFonts w:ascii="Calibri" w:hAnsi="Calibri"/>
+      <w:sz w:val="22"/>
+    </w:rPr>
   </w:style>
   <w:style w:type="paragraph" w:styleId="Header">
     <w:name w:val="header"/>

</xml_diff>